<commit_message>
Restore visual Code Scanning guide for PR contributors
</commit_message>
<xml_diff>
--- a/docs/guia-usuario-prs.docx
+++ b/docs/guia-usuario-prs.docx
@@ -7,7 +7,275 @@
         <w:pStyle w:val="Title"/>
       </w:pPr>
       <w:r>
-        <w:t>Guia de PRs: Actions e Code Scanning</w:t>
+        <w:t>Guia do usuário para Pull Requests e verificações de segurança</w:t>
+      </w:r>
+    </w:p>
+    <w:p>
+      <w:r>
+        <w:t xml:space="preserve">Este guia explica como autores e revisores de código acompanham um Pull Request (PR) no GitHub quando há verificações automáticas. Ele ajuda a interpretar resultados do GitHub Actions e do GitHub Advanced Security (GHAS), responder a alertas e decidir o que precisa de revisão humana. O administrador do repositório configura as ferramentas; as instruções de configuração ficam no </w:t>
+      </w:r>
+      <w:r>
+        <w:t>guia da mantenedora — guia-github-actions-e-seguranca.md</w:t>
+      </w:r>
+      <w:r>
+        <w:t>.</w:t>
+      </w:r>
+    </w:p>
+    <w:p>
+      <w:r>
+        <w:t>Um check verde significa que aquela verificação terminou com sucesso. Isso não prova, por si só, que o código está livre de defeitos ou seguro. Alertas de segurança e bloqueios de merge também são coisas diferentes: o alerta aponta um achado; a regra de proteção da branch define se o merge fica impedido até a resolução.</w:t>
+      </w:r>
+    </w:p>
+    <w:p>
+      <w:pPr>
+        <w:pStyle w:val="Heading1"/>
+      </w:pPr>
+      <w:r>
+        <w:t>1. Quem faz o quê</w:t>
+      </w:r>
+    </w:p>
+    <w:p>
+      <w:pPr>
+        <w:pStyle w:val="ListBullet"/>
+      </w:pPr>
+      <w:r>
+        <w:rPr>
+          <w:b/>
+        </w:rPr>
+        <w:t>Autor do PR:</w:t>
+      </w:r>
+      <w:r>
+        <w:t xml:space="preserve"> descreve a mudança, acompanha os checks, corrige falhas e responde às observações da revisão.</w:t>
+      </w:r>
+    </w:p>
+    <w:p>
+      <w:pPr>
+        <w:pStyle w:val="ListBullet"/>
+      </w:pPr>
+      <w:r>
+        <w:rPr>
+          <w:b/>
+        </w:rPr>
+        <w:t>Revisor:</w:t>
+      </w:r>
+      <w:r>
+        <w:t xml:space="preserve"> entende o objetivo e o diff, verifica os resultados automáticos e pede ajustes quando necessário.</w:t>
+      </w:r>
+    </w:p>
+    <w:p>
+      <w:pPr>
+        <w:pStyle w:val="ListBullet"/>
+      </w:pPr>
+      <w:r>
+        <w:rPr>
+          <w:b/>
+        </w:rPr>
+        <w:t>Administrador do repositório:</w:t>
+      </w:r>
+      <w:r>
+        <w:t xml:space="preserve"> habilita e configura workflows, ferramentas de segurança e regras de proteção. Consulte o guia da mantenedora para essas tarefas.</w:t>
+      </w:r>
+    </w:p>
+    <w:p>
+      <w:pPr>
+        <w:pStyle w:val="ListBullet"/>
+      </w:pPr>
+      <w:r>
+        <w:rPr>
+          <w:b/>
+        </w:rPr>
+        <w:t>Bots:</w:t>
+      </w:r>
+      <w:r>
+        <w:t xml:space="preserve"> podem executar análises ou propor atualizações. Um resultado automático não substitui a revisão e aprovação previstas pelo processo da equipe.</w:t>
+      </w:r>
+    </w:p>
+    <w:p>
+      <w:pPr>
+        <w:pStyle w:val="Heading1"/>
+      </w:pPr>
+      <w:r>
+        <w:t>2. Fluxo normal de um Pull Request</w:t>
+      </w:r>
+    </w:p>
+    <w:p>
+      <w:pPr>
+        <w:pStyle w:val="ListNumber"/>
+      </w:pPr>
+      <w:r>
+        <w:t>Crie uma branch para a mudança e mantenha cada PR focado em um objetivo.</w:t>
+      </w:r>
+    </w:p>
+    <w:p>
+      <w:pPr>
+        <w:pStyle w:val="ListNumber"/>
+      </w:pPr>
+      <w:r>
+        <w:t>Abra o PR para a branch de destino indicada pela equipe. Explique o motivo, o que mudou, como foi verificado e quais riscos merecem atenção.</w:t>
+      </w:r>
+    </w:p>
+    <w:p>
+      <w:pPr>
+        <w:pStyle w:val="ListNumber"/>
+      </w:pPr>
+      <w:r>
+        <w:t xml:space="preserve">Aguarde os checks na área </w:t>
+      </w:r>
+      <w:r>
+        <w:rPr>
+          <w:b/>
+        </w:rPr>
+        <w:t>Checks</w:t>
+      </w:r>
+      <w:r>
+        <w:t xml:space="preserve"> ou na seção de status do PR. Enquanto estiverem em execução, espere a conclusão antes de interpretar o resultado.</w:t>
+      </w:r>
+    </w:p>
+    <w:p>
+      <w:pPr>
+        <w:pStyle w:val="ListNumber"/>
+      </w:pPr>
+      <w:r>
+        <w:t>Se um check falhar, abra o detalhe do job, localize a etapa marcada como falha e leia o log a partir da primeira mensagem de erro relevante. Corrija a causa e envie uma nova alteração para o mesmo PR.</w:t>
+      </w:r>
+    </w:p>
+    <w:p>
+      <w:pPr>
+        <w:pStyle w:val="ListNumber"/>
+      </w:pPr>
+      <w:r>
+        <w:t xml:space="preserve">Revise o diff em </w:t>
+      </w:r>
+      <w:r>
+        <w:rPr>
+          <w:b/>
+        </w:rPr>
+        <w:t>Files changed</w:t>
+      </w:r>
+      <w:r>
+        <w:t xml:space="preserve"> e responda aos comentários. A aprovação e o merge seguem as regras da equipe.</w:t>
+      </w:r>
+    </w:p>
+    <w:p>
+      <w:pPr>
+        <w:pStyle w:val="Heading2"/>
+      </w:pPr>
+      <w:r>
+        <w:t>Como ler o estado de um check</w:t>
+      </w:r>
+    </w:p>
+    <w:p>
+      <w:pPr>
+        <w:pStyle w:val="ListBullet"/>
+      </w:pPr>
+      <w:r>
+        <w:rPr>
+          <w:b/>
+        </w:rPr>
+        <w:t>Em execução:</w:t>
+      </w:r>
+      <w:r>
+        <w:t xml:space="preserve"> o workflow ainda está trabalhando. Aguarde o resultado.</w:t>
+      </w:r>
+    </w:p>
+    <w:p>
+      <w:pPr>
+        <w:pStyle w:val="ListBullet"/>
+      </w:pPr>
+      <w:r>
+        <w:rPr>
+          <w:b/>
+        </w:rPr>
+        <w:t>Sucesso:</w:t>
+      </w:r>
+      <w:r>
+        <w:t xml:space="preserve"> as etapas daquele workflow passaram. Confira o que o workflow realmente executou; um build não substitui análise de segurança.</w:t>
+      </w:r>
+    </w:p>
+    <w:p>
+      <w:pPr>
+        <w:pStyle w:val="ListBullet"/>
+      </w:pPr>
+      <w:r>
+        <w:rPr>
+          <w:b/>
+        </w:rPr>
+        <w:t>Falha:</w:t>
+      </w:r>
+      <w:r>
+        <w:t xml:space="preserve"> uma etapa não passou ou encontrou uma condição que encerra o workflow. Abra o log para saber qual.</w:t>
+      </w:r>
+    </w:p>
+    <w:p>
+      <w:pPr>
+        <w:pStyle w:val="ListBullet"/>
+      </w:pPr>
+      <w:r>
+        <w:rPr>
+          <w:b/>
+        </w:rPr>
+        <w:t>Não aparece:</w:t>
+      </w:r>
+      <w:r>
+        <w:t xml:space="preserve"> a verificação pode não estar configurada para esse evento, branch ou linguagem, pode estar desligada ou não ser obrigatória. A ausência não significa que a análise passou.</w:t>
+      </w:r>
+    </w:p>
+    <w:p>
+      <w:pPr>
+        <w:pStyle w:val="ListBullet"/>
+      </w:pPr>
+      <w:r>
+        <w:rPr>
+          <w:b/>
+        </w:rPr>
+        <w:t>Pendente ou ignorado:</w:t>
+      </w:r>
+      <w:r>
+        <w:t xml:space="preserve"> verifique a explicação no GitHub e siga o processo da equipe. Não presuma que isso equivale a uma aprovação.</w:t>
+      </w:r>
+    </w:p>
+    <w:p>
+      <w:r>
+        <w:t>Checks podem vir de GitHub Actions, Code Scanning ou outros serviços. O nome e o propósito aparecem no próprio check.</w:t>
+      </w:r>
+    </w:p>
+    <w:p>
+      <w:pPr>
+        <w:pStyle w:val="Heading1"/>
+      </w:pPr>
+      <w:r>
+        <w:t>3. O que cada ferramenta indica para quem envia ou revisa PRs</w:t>
+      </w:r>
+    </w:p>
+    <w:p>
+      <w:pPr>
+        <w:pStyle w:val="Heading2"/>
+      </w:pPr>
+      <w:r>
+        <w:t>GitHub Actions</w:t>
+      </w:r>
+    </w:p>
+    <w:p>
+      <w:r>
+        <w:t>Actions executa os workflows definidos para eventos como abrir ou atualizar um PR. Um workflow pode compilar o projeto, rodar testes, verificar estilo ou executar outras tarefas. Consulte o resultado e os logs do job que corresponde à falha. Se o workflow está verde, conclua apenas que as tarefas configuradas nele passaram naquela execução.</w:t>
+      </w:r>
+    </w:p>
+    <w:p>
+      <w:pPr>
+        <w:pStyle w:val="Heading2"/>
+      </w:pPr>
+      <w:r>
+        <w:t>Code Scanning</w:t>
+      </w:r>
+    </w:p>
+    <w:p>
+      <w:r>
+        <w:t>Quando uma análise de código está configurada para o PR, ela pode exibir alertas e anotações com a regra, severidade, arquivo e trecho relacionado. Abra o alerta para entender o caminho do dado, o risco e a correção sugerida; depois confira o contexto completo no diff.</w:t>
+      </w:r>
+    </w:p>
+    <w:p>
+      <w:r>
+        <w:t>Um alerta não significa automaticamente que o merge será bloqueado. Isso depende das regras de proteção e da configuração do check. Da mesma forma, nenhum alerta pode significar que a análise não encontrou problemas que reconhece, que não foi executada ou que não cobre aquele caso. Considere a linguagem, o tipo de análise e o código efetivamente analisado.</w:t>
       </w:r>
     </w:p>
     <w:p>
@@ -15,10 +283,88 @@
         <w:rPr>
           <w:b/>
         </w:rPr>
-        <w:t>Público:</w:t>
+        <w:t>Ao encontrar um alerta:</w:t>
+      </w:r>
+    </w:p>
+    <w:p>
+      <w:pPr>
+        <w:pStyle w:val="ListNumber"/>
+      </w:pPr>
+      <w:r>
+        <w:t>Leia a descrição, severidade, arquivo e linha indicados.</w:t>
+      </w:r>
+    </w:p>
+    <w:p>
+      <w:pPr>
+        <w:pStyle w:val="ListNumber"/>
+      </w:pPr>
+      <w:r>
+        <w:t>Entenda se o achado é real no contexto da mudança; não descarte apenas porque o build passou.</w:t>
+      </w:r>
+    </w:p>
+    <w:p>
+      <w:pPr>
+        <w:pStyle w:val="ListNumber"/>
+      </w:pPr>
+      <w:r>
+        <w:t>Corrija a origem do problema e acrescente ou ajuste testes quando fizer sentido.</w:t>
+      </w:r>
+    </w:p>
+    <w:p>
+      <w:pPr>
+        <w:pStyle w:val="ListNumber"/>
+      </w:pPr>
+      <w:r>
+        <w:t>Envie a correção e confira a nova análise. Se considerar o alerta incorreto, siga o processo da equipe para justificar e solicitar triagem; não o oculte sem explicação.</w:t>
+      </w:r>
+    </w:p>
+    <w:p>
+      <w:pPr>
+        <w:pStyle w:val="Heading2"/>
+      </w:pPr>
+      <w:r>
+        <w:t>Dependabot</w:t>
+      </w:r>
+    </w:p>
+    <w:p>
+      <w:r>
+        <w:t xml:space="preserve">Dependabot pode abrir PRs de </w:t>
       </w:r>
       <w:r>
-        <w:t xml:space="preserve"> pessoas que criam, revisam ou atualizam pull requests</w:t>
+        <w:rPr>
+          <w:b/>
+        </w:rPr>
+        <w:t>atualização de segurança</w:t>
+      </w:r>
+      <w:r>
+        <w:t xml:space="preserve"> para dependências vulneráveis ou de </w:t>
+      </w:r>
+      <w:r>
+        <w:rPr>
+          <w:b/>
+        </w:rPr>
+        <w:t>atualização de versão</w:t>
+      </w:r>
+      <w:r>
+        <w:t xml:space="preserve"> para manter dependências atualizadas. O PR normalmente identifica a dependência e a versão proposta, e pode incluir informações sobre a atualização.</w:t>
+      </w:r>
+    </w:p>
+    <w:p>
+      <w:r>
+        <w:t>Trate-o como uma alteração de código: confira o diff, o motivo da atualização, a compatibilidade e os checks. Veja notas de versão quando uma atualização puder alterar comportamento. Um PR criado pelo Dependabot não é uma aprovação humana; siga o processo normal de revisão e aprovação.</w:t>
+      </w:r>
+    </w:p>
+    <w:p>
+      <w:pPr>
+        <w:pStyle w:val="Heading2"/>
+      </w:pPr>
+      <w:r>
+        <w:t>Secret Scanning e Push Protection</w:t>
+      </w:r>
+    </w:p>
+    <w:p>
+      <w:r>
+        <w:t>Secret Scanning procura padrões de credenciais expostas no repositório e pode gerar alertas. Push Protection pode bloquear um envio quando detecta um possível segredo, conforme a configuração aplicada.</w:t>
       </w:r>
     </w:p>
     <w:p>
@@ -26,94 +372,7 @@
         <w:rPr>
           <w:b/>
         </w:rPr>
-        <w:t>Objetivo:</w:t>
-      </w:r>
-      <w:r>
-        <w:t xml:space="preserve"> interpretar os checks de compilação e de segurança antes da revisão.</w:t>
-      </w:r>
-    </w:p>
-    <w:p>
-      <w:pPr>
-        <w:pStyle w:val="Heading1"/>
-      </w:pPr>
-      <w:r>
-        <w:t>O que acontece quando um PR é aberto</w:t>
-      </w:r>
-    </w:p>
-    <w:p>
-      <w:r>
-        <w:t>O workflow de build compila o projeto e executa seus testes. O CodeQL está configurado no Default setup do GitHub e publica os resultados do Code Scanning. Um workflow separado, Code Scanning metrics, prepara um arquivo baixável com um retrato dos alertas e das análises que a API do GitHub registrou. Em Default setup, o GitHub administra as análises; a rotina de métricas não configura nem inicia o CodeQL.</w:t>
-      </w:r>
-    </w:p>
-    <w:p>
-      <w:r>
-        <w:t>O material do GitHub abaixo compara a configuração gerenciada pelo GitHub (Default setup) com Advanced setup, que cria um workflow editável. É uma explicação geral do produto, não uma captura do código do PR.</w:t>
-      </w:r>
-    </w:p>
-    <w:p>
-      <w:pPr>
-        <w:jc w:val="center"/>
-      </w:pPr>
-      <w:r>
-        <w:drawing>
-          <wp:inline xmlns:a="http://schemas.openxmlformats.org/drawingml/2006/main" xmlns:pic="http://schemas.openxmlformats.org/drawingml/2006/picture">
-            <wp:extent cx="5806440" cy="3439334"/>
-            <wp:docPr id="1" name="Picture 1"/>
-            <wp:cNvGraphicFramePr>
-              <a:graphicFrameLocks noChangeAspect="1"/>
-            </wp:cNvGraphicFramePr>
-            <a:graphic>
-              <a:graphicData uri="http://schemas.openxmlformats.org/drawingml/2006/picture">
-                <pic:pic>
-                  <pic:nvPicPr>
-                    <pic:cNvPr id="0" name="05-github-docs-default-advanced.png"/>
-                    <pic:cNvPicPr/>
-                  </pic:nvPicPr>
-                  <pic:blipFill>
-                    <a:blip r:embed="rId11"/>
-                    <a:stretch>
-                      <a:fillRect/>
-                    </a:stretch>
-                  </pic:blipFill>
-                  <pic:spPr>
-                    <a:xfrm>
-                      <a:off x="0" y="0"/>
-                      <a:ext cx="5806440" cy="3439334"/>
-                    </a:xfrm>
-                    <a:prstGeom prst="rect"/>
-                  </pic:spPr>
-                </pic:pic>
-              </a:graphicData>
-            </a:graphic>
-          </wp:inline>
-        </w:drawing>
-      </w:r>
-    </w:p>
-    <w:p>
-      <w:pPr>
-        <w:pStyle w:val="Caption"/>
-        <w:jc w:val="center"/>
-      </w:pPr>
-      <w:r>
-        <w:t>Material do GitHub Docs comparando Default setup e Advanced setup</w:t>
-      </w:r>
-    </w:p>
-    <w:p>
-      <w:r>
-        <w:t>Depois que a mantenedora aprovar e mesclar o workflow, ele gerará snapshots em pushes para main e diariamente ao meio-dia de Brasília. Ele não executa automaticamente em cada PR. Para um PR específico, a mantenedora pode iniciar Actions &gt; Code Scanning metrics &gt; Run workflow na branch main e informar o número do PR; o script consulta os dados do PR pela API sem executar o código proposto. Esse horário diário agenda o relatório, não uma análise CodeQL. A frequência da análise CodeQL é administrada pelo Default setup nas configurações do repositório.</w:t>
-      </w:r>
-    </w:p>
-    <w:p>
-      <w:pPr>
-        <w:pStyle w:val="Heading1"/>
-      </w:pPr>
-      <w:r>
-        <w:t>Relatório de métricas de uma execução</w:t>
-      </w:r>
-    </w:p>
-    <w:p>
-      <w:r>
-        <w:t>Abra Actions no repositório.</w:t>
+        <w:t>Se o envio for bloqueado:</w:t>
       </w:r>
     </w:p>
     <w:p>
@@ -121,7 +380,7 @@
         <w:pStyle w:val="ListNumber"/>
       </w:pPr>
       <w:r>
-        <w:t>Entre na execução Code Scanning metrics relacionada ao push para main, à agenda diária ou à execução manual solicitada para o PR.</w:t>
+        <w:t>Não coloque uma credencial real em um PR ou commit de teste.</w:t>
       </w:r>
     </w:p>
     <w:p>
@@ -129,7 +388,86 @@
         <w:pStyle w:val="ListNumber"/>
       </w:pPr>
       <w:r>
-        <w:t>Entre na execução Code Scanning metrics relacionada ao push para main, à agenda diária ou à execução manual solicitada para o PR.</w:t>
+        <w:t>Remova o valor do código e use o mecanismo de armazenamento aprovado pela equipe.</w:t>
+      </w:r>
+    </w:p>
+    <w:p>
+      <w:pPr>
+        <w:pStyle w:val="ListNumber"/>
+      </w:pPr>
+      <w:r>
+        <w:t>Se a credencial for verdadeira ou tiver sido exposta, avise imediatamente o responsável e revogue ou rotacione o segredo. Apagar o texto do commit, sozinho, não invalida uma credencial que já foi exposta.</w:t>
+      </w:r>
+    </w:p>
+    <w:p>
+      <w:pPr>
+        <w:pStyle w:val="ListNumber"/>
+      </w:pPr>
+      <w:r>
+        <w:t>Só use uma opção de bypass se a política da organização permitir e houver justificativa aprovada. O bypass pode registrar um alerta e não deve servir para contornar a correção.</w:t>
+      </w:r>
+    </w:p>
+    <w:p>
+      <w:r>
+        <w:t>Se o padrão detectado for um falso positivo ou um valor de teste sem validade, siga o procedimento definido pelos administradores para revisar o bloqueio.</w:t>
+      </w:r>
+    </w:p>
+    <w:p>
+      <w:pPr>
+        <w:pStyle w:val="Heading2"/>
+      </w:pPr>
+      <w:r>
+        <w:t>Consultar o relatório de métricas do Code Scanning</w:t>
+      </w:r>
+    </w:p>
+    <w:p>
+      <w:r>
+        <w:t>O workflow gera um relatório baixável com o estado dos alertas e as análises que a API do GitHub registrou para o branch ou PR daquela execução. Para obter:</w:t>
+      </w:r>
+    </w:p>
+    <w:p>
+      <w:pPr>
+        <w:pStyle w:val="ListNumber"/>
+      </w:pPr>
+      <w:r>
+        <w:t xml:space="preserve">Depois que a mantenedora aprovar e mesclar a alteração, abra </w:t>
+      </w:r>
+      <w:r>
+        <w:rPr>
+          <w:b/>
+        </w:rPr>
+        <w:t>Actions</w:t>
+      </w:r>
+      <w:r>
+        <w:t xml:space="preserve"> no repositório.</w:t>
+      </w:r>
+    </w:p>
+    <w:p>
+      <w:pPr>
+        <w:pStyle w:val="ListNumber"/>
+      </w:pPr>
+      <w:r>
+        <w:t xml:space="preserve">Entre na execução </w:t>
+      </w:r>
+      <w:r>
+        <w:rPr>
+          <w:b/>
+        </w:rPr>
+        <w:t>Code Scanning metrics</w:t>
+      </w:r>
+      <w:r>
+        <w:t xml:space="preserve"> relacionada ao push para </w:t>
+      </w:r>
+      <w:r>
+        <w:rPr>
+          <w:rFonts w:ascii="Consolas" w:hAnsi="Consolas"/>
+          <w:color w:val="5B2C83"/>
+          <w:sz w:val="18"/>
+        </w:rPr>
+        <w:t>main</w:t>
+      </w:r>
+      <w:r>
+        <w:t>, à agenda diária ou à execução manual solicitada para o PR.</w:t>
       </w:r>
     </w:p>
     <w:p>
@@ -165,247 +503,94 @@
         <w:pStyle w:val="ListNumber"/>
       </w:pPr>
       <w:r>
-        <w:t>Extraia o ZIP. alerts-summary.csv resume alertas abertos, dispensados e corrigidos por severidade. dismissal-reasons.csv resume os motivos dos alertas atualmente dispensados. analysis-configurations.csv lista categoria, ferramenta, horário, commit, quantidade de resultados, regras executadas e se aquela categoria corresponde ao commit da execução. snapshot.json reúne esses dados e o contexto da execução, incluindo analysis.matched_current_execution.</w:t>
+        <w:t xml:space="preserve">Extraia o ZIP. </w:t>
+      </w:r>
+      <w:r>
+        <w:rPr>
+          <w:rFonts w:ascii="Consolas" w:hAnsi="Consolas"/>
+          <w:color w:val="5B2C83"/>
+          <w:sz w:val="18"/>
+        </w:rPr>
+        <w:t>alerts-summary.csv</w:t>
+      </w:r>
+      <w:r>
+        <w:t xml:space="preserve"> resume alertas abertos, com dismiss e corrigidos por severidade. </w:t>
+      </w:r>
+      <w:r>
+        <w:rPr>
+          <w:rFonts w:ascii="Consolas" w:hAnsi="Consolas"/>
+          <w:color w:val="5B2C83"/>
+          <w:sz w:val="18"/>
+        </w:rPr>
+        <w:t>dismissal-reasons.csv</w:t>
+      </w:r>
+      <w:r>
+        <w:t xml:space="preserve"> resume os motivos dos alertas com dismiss atualmente. </w:t>
+      </w:r>
+      <w:r>
+        <w:rPr>
+          <w:rFonts w:ascii="Consolas" w:hAnsi="Consolas"/>
+          <w:color w:val="5B2C83"/>
+          <w:sz w:val="18"/>
+        </w:rPr>
+        <w:t>analysis-configurations.csv</w:t>
+      </w:r>
+      <w:r>
+        <w:t xml:space="preserve"> lista categoria, ferramenta, horário, commit, quantidade de resultados, regras executadas e se aquela categoria corresponde ao commit da execução. </w:t>
+      </w:r>
+      <w:r>
+        <w:rPr>
+          <w:rFonts w:ascii="Consolas" w:hAnsi="Consolas"/>
+          <w:color w:val="5B2C83"/>
+          <w:sz w:val="18"/>
+        </w:rPr>
+        <w:t>snapshot.json</w:t>
+      </w:r>
+      <w:r>
+        <w:t xml:space="preserve"> reúne esses dados e o contexto da execução, incluindo </w:t>
+      </w:r>
+      <w:r>
+        <w:rPr>
+          <w:rFonts w:ascii="Consolas" w:hAnsi="Consolas"/>
+          <w:color w:val="5B2C83"/>
+          <w:sz w:val="18"/>
+        </w:rPr>
+        <w:t>analysis.matched_current_execution</w:t>
+      </w:r>
+      <w:r>
+        <w:t>.</w:t>
       </w:r>
     </w:p>
     <w:p>
       <w:r>
-        <w:t>Os relatórios não mostram quem dispensou alertas, comentários, caminhos de arquivos nem detalhes individuais. A contagem de dismiss representa alertas que estão dispensados naquele momento do snapshot, não o total de ações de dismiss já realizadas. Compare snapshots de execuções diferentes para acompanhar a evolução. As categorias mostram as análises registradas, mas a API usada não informa quantos arquivos-fonte foram examinados. Em execuções de push, a rotina aguarda até dez minutos pela análise correspondente; em uma execução manual de PR, usa o número informado para consultar a análise do PR. Se matched_current_execution for false, as análises listadas são apenas as mais recentes disponíveis. O snapshot diário registra o estado atual e pode listar uma análise CodeQL anterior àquele dia. Os arquivos expiram em até 90 dias; baixe os que precisar guardar.</w:t>
+        <w:t xml:space="preserve">Os relatórios não mostram quem fez dismiss nos alertas, comentários, caminhos de arquivos nem detalhes individuais. A contagem de dismiss representa alertas com esse status naquele momento do snapshot, não o total de ações de dismiss já realizadas. Compare snapshots de execuções diferentes para acompanhar a evolução. As categorias mostram as análises registradas, mas a API usada não informa quantos arquivos-fonte foram examinados. Em execuções de push, a rotina aguarda até dez minutos pela análise correspondente; em uma execução manual de PR, usa o número informado para consultar a análise do PR. Se </w:t>
+      </w:r>
+      <w:r>
+        <w:rPr>
+          <w:rFonts w:ascii="Consolas" w:hAnsi="Consolas"/>
+          <w:color w:val="5B2C83"/>
+          <w:sz w:val="18"/>
+        </w:rPr>
+        <w:t>matched_current_execution</w:t>
+      </w:r>
+      <w:r>
+        <w:t xml:space="preserve"> for </w:t>
+      </w:r>
+      <w:r>
+        <w:rPr>
+          <w:rFonts w:ascii="Consolas" w:hAnsi="Consolas"/>
+          <w:color w:val="5B2C83"/>
+          <w:sz w:val="18"/>
+        </w:rPr>
+        <w:t>false</w:t>
+      </w:r>
+      <w:r>
+        <w:t>, as análises listadas são apenas as mais recentes disponíveis. O snapshot diário registra o estado atual e pode listar uma análise CodeQL anterior àquele dia. Os arquivos expiram em até 90 dias; baixe os que precisar guardar.</w:t>
       </w:r>
     </w:p>
     <w:p>
       <w:r>
-        <w:t>Uma análise CodeQL concluída não garante que não há alertas. Confira também o resultado agregado em Security &gt; Code scanning e leia os detalhes do alerta antes de corrigir ou pedir revisão. O snapshot não contém o resultado interno do job CodeQL gerenciado; se matched_current_execution for false, confira a execução CodeQL em Actions e trate as categorias listadas como análises anteriores.</w:t>
-      </w:r>
-    </w:p>
-    <w:p>
-      <w:pPr>
-        <w:pStyle w:val="Heading1"/>
-      </w:pPr>
-      <w:r>
-        <w:t>Como interpretar os resultados</w:t>
-      </w:r>
-    </w:p>
-    <w:tbl>
-      <w:tblPr>
-        <w:tblStyle w:val="LightShading-Accent1"/>
-        <w:tblW w:type="auto" w:w="0"/>
-        <w:jc w:val="center"/>
-        <w:tblLook w:firstColumn="1" w:firstRow="1" w:lastColumn="0" w:lastRow="0" w:noHBand="0" w:noVBand="1" w:val="04A0"/>
-      </w:tblPr>
-      <w:tblGrid>
-        <w:gridCol w:w="3331"/>
-        <w:gridCol w:w="3331"/>
-        <w:gridCol w:w="3331"/>
-      </w:tblGrid>
-      <w:tr>
-        <w:tc>
-          <w:tcPr>
-            <w:tcW w:type="dxa" w:w="3331"/>
-            <w:vAlign w:val="center"/>
-          </w:tcPr>
-          <w:p>
-            <w:r>
-              <w:rPr>
-                <w:b/>
-                <w:color w:val="FFFFFF"/>
-              </w:rPr>
-              <w:t>Resultado</w:t>
-            </w:r>
-          </w:p>
-        </w:tc>
-        <w:tc>
-          <w:tcPr>
-            <w:tcW w:type="dxa" w:w="3331"/>
-            <w:vAlign w:val="center"/>
-          </w:tcPr>
-          <w:p>
-            <w:r>
-              <w:rPr>
-                <w:b/>
-                <w:color w:val="FFFFFF"/>
-              </w:rPr>
-              <w:t>O que informa</w:t>
-            </w:r>
-          </w:p>
-        </w:tc>
-        <w:tc>
-          <w:tcPr>
-            <w:tcW w:type="dxa" w:w="3331"/>
-            <w:vAlign w:val="center"/>
-          </w:tcPr>
-          <w:p>
-            <w:r>
-              <w:rPr>
-                <w:b/>
-                <w:color w:val="FFFFFF"/>
-              </w:rPr>
-              <w:t>Próximo passo</w:t>
-            </w:r>
-          </w:p>
-        </w:tc>
-      </w:tr>
-      <w:tr>
-        <w:tc>
-          <w:tcPr>
-            <w:tcW w:type="dxa" w:w="3331"/>
-            <w:vAlign w:val="center"/>
-          </w:tcPr>
-          <w:p>
-            <w:r>
-              <w:t>Build/teste aprovado</w:t>
-            </w:r>
-          </w:p>
-        </w:tc>
-        <w:tc>
-          <w:tcPr>
-            <w:tcW w:type="dxa" w:w="3331"/>
-            <w:vAlign w:val="center"/>
-          </w:tcPr>
-          <w:p>
-            <w:r>
-              <w:t>Compilação e testes configurados terminaram com sucesso.</w:t>
-            </w:r>
-          </w:p>
-        </w:tc>
-        <w:tc>
-          <w:tcPr>
-            <w:tcW w:type="dxa" w:w="3331"/>
-            <w:vAlign w:val="center"/>
-          </w:tcPr>
-          <w:p>
-            <w:r>
-              <w:t>Confira também a análise de segurança e a revisão.</w:t>
-            </w:r>
-          </w:p>
-        </w:tc>
-      </w:tr>
-      <w:tr>
-        <w:tc>
-          <w:tcPr>
-            <w:tcW w:type="dxa" w:w="3331"/>
-            <w:vAlign w:val="center"/>
-          </w:tcPr>
-          <w:p>
-            <w:r>
-              <w:t>Job de análise CodeQL aprovado</w:t>
-            </w:r>
-          </w:p>
-        </w:tc>
-        <w:tc>
-          <w:tcPr>
-            <w:tcW w:type="dxa" w:w="3331"/>
-            <w:vAlign w:val="center"/>
-          </w:tcPr>
-          <w:p>
-            <w:r>
-              <w:t>O scanner foi executado para aquela linguagem.</w:t>
-            </w:r>
-          </w:p>
-        </w:tc>
-        <w:tc>
-          <w:tcPr>
-            <w:tcW w:type="dxa" w:w="3331"/>
-            <w:vAlign w:val="center"/>
-          </w:tcPr>
-          <w:p>
-            <w:r>
-              <w:t>Abra o resultado agregado de Code Scanning; um job concluído pode ter encontrado alertas.</w:t>
-            </w:r>
-          </w:p>
-        </w:tc>
-      </w:tr>
-      <w:tr>
-        <w:tc>
-          <w:tcPr>
-            <w:tcW w:type="dxa" w:w="3331"/>
-            <w:vAlign w:val="center"/>
-          </w:tcPr>
-          <w:p>
-            <w:r>
-              <w:t>Alerta em Code Scanning</w:t>
-            </w:r>
-          </w:p>
-        </w:tc>
-        <w:tc>
-          <w:tcPr>
-            <w:tcW w:type="dxa" w:w="3331"/>
-            <w:vAlign w:val="center"/>
-          </w:tcPr>
-          <w:p>
-            <w:r>
-              <w:t>Uma regra identificou um fluxo ou padrão que merece investigação.</w:t>
-            </w:r>
-          </w:p>
-        </w:tc>
-        <w:tc>
-          <w:tcPr>
-            <w:tcW w:type="dxa" w:w="3331"/>
-            <w:vAlign w:val="center"/>
-          </w:tcPr>
-          <w:p>
-            <w:r>
-              <w:t>Leia a regra, severidade, arquivo, linha, origem e destino do fluxo.</w:t>
-            </w:r>
-          </w:p>
-        </w:tc>
-      </w:tr>
-      <w:tr>
-        <w:tc>
-          <w:tcPr>
-            <w:tcW w:type="dxa" w:w="3331"/>
-            <w:vAlign w:val="center"/>
-          </w:tcPr>
-          <w:p>
-            <w:r>
-              <w:t>Check agregado vermelho</w:t>
-            </w:r>
-          </w:p>
-        </w:tc>
-        <w:tc>
-          <w:tcPr>
-            <w:tcW w:type="dxa" w:w="3331"/>
-            <w:vAlign w:val="center"/>
-          </w:tcPr>
-          <w:p>
-            <w:r>
-              <w:t>Há um resultado que falhou a condição do check, como um novo alerta.</w:t>
-            </w:r>
-          </w:p>
-        </w:tc>
-        <w:tc>
-          <w:tcPr>
-            <w:tcW w:type="dxa" w:w="3331"/>
-            <w:vAlign w:val="center"/>
-          </w:tcPr>
-          <w:p>
-            <w:r>
-              <w:t>Corrija e envie um commit atualizado; confirme que a nova análise refletiu a correção.</w:t>
-            </w:r>
-          </w:p>
-        </w:tc>
-      </w:tr>
-    </w:tbl>
-    <w:p/>
-    <w:p>
-      <w:r>
-        <w:t>Um check vermelho não bloqueia merge por si só. A administração precisa tornar esse check obrigatório em regras de proteção da branch. Mesmo quando o GitHub permite mesclar, a pessoa autora deve corrigir o problema ou seguir o processo de exceção da organização.</w:t>
-      </w:r>
-    </w:p>
-    <w:p>
-      <w:pPr>
-        <w:pStyle w:val="Heading1"/>
-      </w:pPr>
-      <w:r>
-        <w:t>O que fazer quando o alerta aponta uma vulnerabilidade</w:t>
-      </w:r>
-    </w:p>
-    <w:p>
-      <w:pPr>
-        <w:pStyle w:val="ListNumber"/>
-      </w:pPr>
-      <w:r>
-        <w:t xml:space="preserve">Abra o alerta a partir do PR ou de </w:t>
+        <w:t xml:space="preserve">Uma análise CodeQL concluída não garante que não há alertas. Confira também o resultado agregado em </w:t>
       </w:r>
       <w:r>
         <w:rPr>
@@ -414,7 +599,51 @@
         <w:t>Security &gt; Code scanning</w:t>
       </w:r>
       <w:r>
-        <w:t>.</w:t>
+        <w:t xml:space="preserve"> e leia os detalhes do alerta antes de corrigir ou pedir revisão. O snapshot não contém o resultado interno do job CodeQL gerenciado; se </w:t>
+      </w:r>
+      <w:r>
+        <w:rPr>
+          <w:rFonts w:ascii="Consolas" w:hAnsi="Consolas"/>
+          <w:color w:val="5B2C83"/>
+          <w:sz w:val="18"/>
+        </w:rPr>
+        <w:t>matched_current_execution</w:t>
+      </w:r>
+      <w:r>
+        <w:t xml:space="preserve"> for </w:t>
+      </w:r>
+      <w:r>
+        <w:rPr>
+          <w:rFonts w:ascii="Consolas" w:hAnsi="Consolas"/>
+          <w:color w:val="5B2C83"/>
+          <w:sz w:val="18"/>
+        </w:rPr>
+        <w:t>false</w:t>
+      </w:r>
+      <w:r>
+        <w:t xml:space="preserve">, confira a execução CodeQL em </w:t>
+      </w:r>
+      <w:r>
+        <w:rPr>
+          <w:b/>
+        </w:rPr>
+        <w:t>Actions</w:t>
+      </w:r>
+      <w:r>
+        <w:t xml:space="preserve"> e trate as categorias listadas como análises anteriores.</w:t>
+      </w:r>
+    </w:p>
+    <w:p>
+      <w:pPr>
+        <w:pStyle w:val="Heading1"/>
+      </w:pPr>
+      <w:r>
+        <w:t>4. Alerta encontrado versus merge bloqueado</w:t>
+      </w:r>
+    </w:p>
+    <w:p>
+      <w:r>
+        <w:t>O GitHub pode mostrar um alerta para ajudar a equipe a localizar um problema sem impedir o merge. Para bloquear o merge, o repositório precisa exigir o check relevante ou outra regra aplicável. O usuário deve:</w:t>
       </w:r>
     </w:p>
     <w:p>
@@ -422,7 +651,7 @@
         <w:pStyle w:val="ListNumber"/>
       </w:pPr>
       <w:r>
-        <w:t>Leia a regra e a explicação do fluxo. Confirme qual dado é controlado por entrada externa e onde ele chega a uma operação sensível.</w:t>
+        <w:t>verificar se o resultado está concluído e qual ferramenta o produziu;</w:t>
       </w:r>
     </w:p>
     <w:p>
@@ -430,7 +659,7 @@
         <w:pStyle w:val="ListNumber"/>
       </w:pPr>
       <w:r>
-        <w:t>Corrija a causa no código e acrescente ou ajuste testes quando fizer sentido.</w:t>
+        <w:t>abrir os detalhes do alerta ou do check e entender a ação esperada;</w:t>
       </w:r>
     </w:p>
     <w:p>
@@ -438,7 +667,7 @@
         <w:pStyle w:val="ListNumber"/>
       </w:pPr>
       <w:r>
-        <w:t>Envie um commit para a mesma branch do PR. O build, o CodeQL conforme o Default setup e o workflow de métricas serão executados conforme seus próprios gatilhos.</w:t>
+        <w:t>corrigir o problema ou encaminhar a triagem conforme a política da equipe;</w:t>
       </w:r>
     </w:p>
     <w:p>
@@ -446,12 +675,20 @@
         <w:pStyle w:val="ListNumber"/>
       </w:pPr>
       <w:r>
-        <w:t>Confirme que o alerta foi atualizado ou fechado e peça revisão.</w:t>
+        <w:t>confirmar que a nova execução reflete a correção;</w:t>
+      </w:r>
+    </w:p>
+    <w:p>
+      <w:pPr>
+        <w:pStyle w:val="ListNumber"/>
+      </w:pPr>
+      <w:r>
+        <w:t>aguardar as aprovações exigidas antes do merge.</w:t>
       </w:r>
     </w:p>
     <w:p>
       <w:r>
-        <w:t>Não descarte um alerta apenas para deixar o check verde. Use dismiss somente quando a análise confirmar que é falso positivo ou que existe uma justificativa aceita pela política da organização.</w:t>
+        <w:t>Não trate “sem check”, “check verde” e “alerta resolvido” como estados equivalentes.</w:t>
       </w:r>
     </w:p>
     <w:p>
@@ -459,29 +696,123 @@
         <w:pStyle w:val="Heading2"/>
       </w:pPr>
       <w:r>
-        <w:t>Exemplo didático de resultado</w:t>
+        <w:t>Fazer triagem e usar dismiss com responsabilidade</w:t>
       </w:r>
     </w:p>
     <w:p>
       <w:r>
-        <w:t>No PR usado para o exercício, os jobs que executaram a análise CodeQL terminaram com sucesso, mas o resultado agregado encontrou uma vulnerabilidade High de SQL Injection e apontou o trecho de código. Isso mostra a diferença entre “o scanner conseguiu rodar” e “o scanner não encontrou problemas”. O alerta pode deixar o check de Code Scanning vermelho mesmo quando o build e os jobs de análise terminaram.</w:t>
+        <w:t xml:space="preserve">Corrigir o código é a forma preferida de resolver um alerta. Use </w:t>
+      </w:r>
+      <w:r>
+        <w:rPr>
+          <w:b/>
+        </w:rPr>
+        <w:t>dismiss</w:t>
+      </w:r>
+      <w:r>
+        <w:t xml:space="preserve"> somente depois de abrir os detalhes do alerta e confirmar por que uma alteração de código não é necessária, por exemplo, quando for um falso positivo ou quando o achado estiver somente em código de teste. A decisão deve seguir a política de segurança da equipe.</w:t>
       </w:r>
     </w:p>
     <w:p>
       <w:r>
-        <w:t xml:space="preserve">Evidências para consulta: </w:t>
+        <w:t xml:space="preserve">Ao usar dismiss, escolha o motivo com cuidado. O GitHub registra o motivo, tira o alerta da contagem de alertas atuais e o move para a lista </w:t>
       </w:r>
       <w:r>
-        <w:t>execução do workflow — https://github.com/aeroschmidt/scanner-loja-instrumentos/actions/runs/38105323924</w:t>
+        <w:rPr>
+          <w:b/>
+        </w:rPr>
+        <w:t>Closed</w:t>
+      </w:r>
+      <w:r>
+        <w:t>, onde ele pode ser reaberto. O dismiss se aplica a todos os branches. Na próxima análise, o mesmo código não gera o mesmo alerta; a escolha do motivo também pode afetar se a consulta continuará participando de análises futuras.</w:t>
+      </w:r>
+    </w:p>
+    <w:p>
+      <w:r>
+        <w:t xml:space="preserve">Você pode adicionar um </w:t>
+      </w:r>
+      <w:r>
+        <w:rPr>
+          <w:b/>
+        </w:rPr>
+        <w:t>dismissal comment</w:t>
+      </w:r>
+      <w:r>
+        <w:t xml:space="preserve"> para registrar o contexto. O comentário fica na timeline do alerta e pode apoiar futuras auditorias e relatórios. Inclua, quando aplicável:</w:t>
+      </w:r>
+    </w:p>
+    <w:p>
+      <w:pPr>
+        <w:pStyle w:val="ListBullet"/>
+      </w:pPr>
+      <w:r>
+        <w:t>por que o alerta não exige alteração de código;</w:t>
+      </w:r>
+    </w:p>
+    <w:p>
+      <w:pPr>
+        <w:pStyle w:val="ListBullet"/>
+      </w:pPr>
+      <w:r>
+        <w:t>quem revisou a decisão;</w:t>
+      </w:r>
+    </w:p>
+    <w:p>
+      <w:pPr>
+        <w:pStyle w:val="ListBullet"/>
+      </w:pPr>
+      <w:r>
+        <w:t>se a decisão é temporária ou permanente;</w:t>
+      </w:r>
+    </w:p>
+    <w:p>
+      <w:pPr>
+        <w:pStyle w:val="ListBullet"/>
+      </w:pPr>
+      <w:r>
+        <w:t>controles compensatórios ou trabalho de acompanhamento.</w:t>
+      </w:r>
+    </w:p>
+    <w:p>
+      <w:r>
+        <w:t xml:space="preserve">Em organizações que precisam de governança mais forte, a </w:t>
+      </w:r>
+      <w:r>
+        <w:rPr>
+          <w:b/>
+        </w:rPr>
+        <w:t>delegated alert dismissal</w:t>
+      </w:r>
+      <w:r>
+        <w:t xml:space="preserve"> pode impedir dismiss direto por pessoas com acesso de escrita. Elas solicitam o dismiss; proprietários da organização e security managers podem aprovar ou negar a solicitação. A disponibilidade e configuração dependem do ambiente do GitHub.</w:t>
+      </w:r>
+    </w:p>
+    <w:p>
+      <w:r>
+        <w:t>Não use dismiss apenas para deixar um check verde. Se o risco for real, corrija-o; se houver um motivo válido para dismiss, deixe uma justificativa que outra pessoa possa revisar.</w:t>
+      </w:r>
+    </w:p>
+    <w:p>
+      <w:r>
+        <w:t xml:space="preserve">Referências oficiais: </w:t>
+      </w:r>
+      <w:r>
+        <w:t>Resolver alertas de Code Scanning — https://docs.github.com/en/code-security/how-tos/manage-security-alerts/manage-code-scanning-alerts/resolve-alerts</w:t>
+      </w:r>
+      <w:r>
+        <w:t xml:space="preserve">, </w:t>
+      </w:r>
+      <w:r>
+        <w:t>triagem de alertas em PRs — https://docs.github.com/en/code-security/how-tos/manage-security-alerts/manage-code-scanning-alerts/triage-alerts-in-pull-requests</w:t>
       </w:r>
       <w:r>
         <w:t xml:space="preserve"> e </w:t>
       </w:r>
       <w:r>
-        <w:t>resultado de Code Scanning no pull request — https://github.com/aeroschmidt/scanner-loja-instrumentos/pull/10/checks?check_run_id=114369610380</w:t>
+        <w:t>delegated alert dismissal — https://docs.github.com/en/code-security/concepts/security-at-scale/delegated-alert-dismissal</w:t>
       </w:r>
       <w:r>
-        <w:t>. O PR continua sujeito à revisão da mantenedora; o check só bloqueia merge se for obrigatório nas regras da branch.</w:t>
+        <w:t>.</w:t>
       </w:r>
     </w:p>
     <w:p>
@@ -489,12 +820,62 @@
         <w:pStyle w:val="Heading1"/>
       </w:pPr>
       <w:r>
-        <w:t>Revisão e merge</w:t>
+        <w:t>5. Exercícios controlados para aprender as ferramentas</w:t>
       </w:r>
     </w:p>
     <w:p>
       <w:r>
-        <w:t>A pessoa autora responde aos comentários e checks. A mantenedora revisa e aprova o pull request conforme as regras do repositório. Não presuma que um check verde equivale a aprovação, nem que um check vermelho sempre impede merge: são controles separados.</w:t>
+        <w:t>Uma equipe pode comparar o resultado de uma mudança segura com o de uma vulnerabilidade intencional para entender o que uma análise detecta. Isso deve ocorrer em uma branch ou repositório de laboratório, com dados fictícios e sob supervisão. Nunca introduza credenciais válidas ou código inseguro em uma branch de produção.</w:t>
+      </w:r>
+    </w:p>
+    <w:p>
+      <w:r>
+        <w:t>Para cada exercício:</w:t>
+      </w:r>
+    </w:p>
+    <w:p>
+      <w:pPr>
+        <w:pStyle w:val="ListNumber"/>
+      </w:pPr>
+      <w:r>
+        <w:t>registre o estado inicial e quais verificações estão ativas;</w:t>
+      </w:r>
+    </w:p>
+    <w:p>
+      <w:pPr>
+        <w:pStyle w:val="ListNumber"/>
+      </w:pPr>
+      <w:r>
+        <w:t>faça uma única alteração controlada e descreva o comportamento esperado;</w:t>
+      </w:r>
+    </w:p>
+    <w:p>
+      <w:pPr>
+        <w:pStyle w:val="ListNumber"/>
+      </w:pPr>
+      <w:r>
+        <w:t>abra um PR e observe os checks e alertas sem presumir que a ferramenta necessariamente reconhecerá o caso;</w:t>
+      </w:r>
+    </w:p>
+    <w:p>
+      <w:pPr>
+        <w:pStyle w:val="ListNumber"/>
+      </w:pPr>
+      <w:r>
+        <w:t>compare o resultado com o que a análise realmente executou e com o diff;</w:t>
+      </w:r>
+    </w:p>
+    <w:p>
+      <w:pPr>
+        <w:pStyle w:val="ListNumber"/>
+      </w:pPr>
+      <w:r>
+        <w:t>remova o código inseguro, confirme a nova análise e não faça merge enquanto o risco estiver presente.</w:t>
+      </w:r>
+    </w:p>
+    <w:p>
+      <w:r>
+        <w:t>Uma ferramenta pode não reconhecer um exemplo por limitações de linguagem, configuração, regras selecionadas ou contexto analisado. A finalidade do exercício é aprender o alcance e os limites da verificação, não declarar o código seguro por ausência de alertas.</w:t>
       </w:r>
     </w:p>
     <w:p>
@@ -502,7 +883,12 @@
         <w:pStyle w:val="Heading1"/>
       </w:pPr>
       <w:r>
-        <w:t>Referências</w:t>
+        <w:t>6. Modelo de descrição para PR</w:t>
+      </w:r>
+    </w:p>
+    <w:p>
+      <w:r>
+        <w:t>Adapte este roteiro ao padrão da equipe:</w:t>
       </w:r>
     </w:p>
     <w:p>
@@ -510,7 +896,13 @@
         <w:pStyle w:val="ListBullet"/>
       </w:pPr>
       <w:r>
-        <w:t>Tipos de configuração do Code Scanning — https://docs.github.com/en/code-security/concepts/code-scanning/setup-types</w:t>
+        <w:rPr>
+          <w:b/>
+        </w:rPr>
+        <w:t>Objetivo:</w:t>
+      </w:r>
+      <w:r>
+        <w:t xml:space="preserve"> qual necessidade esta mudança atende?</w:t>
       </w:r>
     </w:p>
     <w:p>
@@ -518,7 +910,13 @@
         <w:pStyle w:val="ListBullet"/>
       </w:pPr>
       <w:r>
-        <w:t>Configuração avançada do Code Scanning — https://docs.github.com/en/code-security/how-tos/find-and-fix-code-vulnerabilities/configure-code-scanning/configuring-advanced-setup-for-code-scanning</w:t>
+        <w:rPr>
+          <w:b/>
+        </w:rPr>
+        <w:t>Alterações:</w:t>
+      </w:r>
+      <w:r>
+        <w:t xml:space="preserve"> o que foi modificado?</w:t>
       </w:r>
     </w:p>
     <w:p>
@@ -526,7 +924,929 @@
         <w:pStyle w:val="ListBullet"/>
       </w:pPr>
       <w:r>
-        <w:t>Triagem de alertas em pull requests — https://docs.github.com/en/code-security/how-tos/manage-security-alerts/manage-code-scanning-alerts/triage-alerts-in-pull-requests</w:t>
+        <w:rPr>
+          <w:b/>
+        </w:rPr>
+        <w:t>Verificação:</w:t>
+      </w:r>
+      <w:r>
+        <w:t xml:space="preserve"> quais testes ou checks foram executados?</w:t>
+      </w:r>
+    </w:p>
+    <w:p>
+      <w:pPr>
+        <w:pStyle w:val="ListBullet"/>
+      </w:pPr>
+      <w:r>
+        <w:rPr>
+          <w:b/>
+        </w:rPr>
+        <w:t>Segurança:</w:t>
+      </w:r>
+      <w:r>
+        <w:t xml:space="preserve"> há alertas, dados sensíveis ou riscos que o revisor deve avaliar?</w:t>
+      </w:r>
+    </w:p>
+    <w:p>
+      <w:pPr>
+        <w:pStyle w:val="ListBullet"/>
+      </w:pPr>
+      <w:r>
+        <w:rPr>
+          <w:b/>
+        </w:rPr>
+        <w:t>Revisão:</w:t>
+      </w:r>
+      <w:r>
+        <w:t xml:space="preserve"> há algum ponto específico que precisa de atenção?</w:t>
+      </w:r>
+    </w:p>
+    <w:p>
+      <w:r>
+        <w:t>Não inclua tokens, senhas, dados pessoais ou segredos nos exemplos, na descrição ou nos comentários do PR.</w:t>
+      </w:r>
+    </w:p>
+    <w:p>
+      <w:pPr>
+        <w:pStyle w:val="Heading1"/>
+      </w:pPr>
+      <w:r>
+        <w:t>7. Checklist rápido</w:t>
+      </w:r>
+    </w:p>
+    <w:p>
+      <w:pPr>
+        <w:pStyle w:val="Heading2"/>
+      </w:pPr>
+      <w:r>
+        <w:t>Para quem abre o PR</w:t>
+      </w:r>
+    </w:p>
+    <w:p>
+      <w:pPr>
+        <w:pStyle w:val="ListBullet"/>
+      </w:pPr>
+      <w:r>
+        <w:t>[ ] O título e a descrição explicam a mudança.</w:t>
+      </w:r>
+    </w:p>
+    <w:p>
+      <w:pPr>
+        <w:pStyle w:val="ListBullet"/>
+      </w:pPr>
+      <w:r>
+        <w:t>[ ] O diff contém somente o escopo esperado.</w:t>
+      </w:r>
+    </w:p>
+    <w:p>
+      <w:pPr>
+        <w:pStyle w:val="ListBullet"/>
+      </w:pPr>
+      <w:r>
+        <w:t>[ ] Os checks terminaram e as falhas foram investigadas.</w:t>
+      </w:r>
+    </w:p>
+    <w:p>
+      <w:pPr>
+        <w:pStyle w:val="ListBullet"/>
+      </w:pPr>
+      <w:r>
+        <w:t>[ ] Alertas de segurança foram tratados ou encaminhados com justificativa.</w:t>
+      </w:r>
+    </w:p>
+    <w:p>
+      <w:pPr>
+        <w:pStyle w:val="ListBullet"/>
+      </w:pPr>
+      <w:r>
+        <w:t>[ ] Nenhuma credencial real foi incluída.</w:t>
+      </w:r>
+    </w:p>
+    <w:p>
+      <w:pPr>
+        <w:pStyle w:val="ListBullet"/>
+      </w:pPr>
+      <w:r>
+        <w:t>[ ] As revisões e aprovações necessárias foram solicitadas.</w:t>
+      </w:r>
+    </w:p>
+    <w:p>
+      <w:pPr>
+        <w:pStyle w:val="Heading2"/>
+      </w:pPr>
+      <w:r>
+        <w:t>Para quem revisa</w:t>
+      </w:r>
+    </w:p>
+    <w:p>
+      <w:pPr>
+        <w:pStyle w:val="ListBullet"/>
+      </w:pPr>
+      <w:r>
+        <w:t>[ ] O diff corresponde ao objetivo informado.</w:t>
+      </w:r>
+    </w:p>
+    <w:p>
+      <w:pPr>
+        <w:pStyle w:val="ListBullet"/>
+      </w:pPr>
+      <w:r>
+        <w:t>[ ] Os checks importantes foram executados e seus resultados foram entendidos.</w:t>
+      </w:r>
+    </w:p>
+    <w:p>
+      <w:pPr>
+        <w:pStyle w:val="ListBullet"/>
+      </w:pPr>
+      <w:r>
+        <w:t>[ ] Alterações de dependências foram avaliadas quanto a segurança e compatibilidade.</w:t>
+      </w:r>
+    </w:p>
+    <w:p>
+      <w:pPr>
+        <w:pStyle w:val="ListBullet"/>
+      </w:pPr>
+      <w:r>
+        <w:t>[ ] Alertas e possíveis segredos foram tratados conforme a política da equipe.</w:t>
+      </w:r>
+    </w:p>
+    <w:p>
+      <w:pPr>
+        <w:pStyle w:val="ListBullet"/>
+      </w:pPr>
+      <w:r>
+        <w:t>[ ] A aprovação considera o código e as regras do repositório; status verde isolado não substitui revisão.</w:t>
+      </w:r>
+    </w:p>
+    <w:p>
+      <w:pPr>
+        <w:pStyle w:val="Heading1"/>
+      </w:pPr>
+      <w:r>
+        <w:t>8. Referências oficiais</w:t>
+      </w:r>
+    </w:p>
+    <w:p>
+      <w:pPr>
+        <w:pStyle w:val="ListBullet"/>
+      </w:pPr>
+      <w:r>
+        <w:t>GitHub Actions: entender workflows — https://docs.github.com/en/actions/about-github-actions/understanding-github-actions</w:t>
+      </w:r>
+    </w:p>
+    <w:p>
+      <w:pPr>
+        <w:pStyle w:val="ListBullet"/>
+      </w:pPr>
+      <w:r>
+        <w:t>Code Scanning: alertas e resultados em Pull Requests — https://docs.github.com/en/code-security/concepts/code-scanning/code-scanning-alerts</w:t>
+      </w:r>
+    </w:p>
+    <w:p>
+      <w:pPr>
+        <w:pStyle w:val="ListBullet"/>
+      </w:pPr>
+      <w:r>
+        <w:t>Checks de status e regras de branch — https://docs.github.com/en/pull-requests/reference/status-checks</w:t>
+      </w:r>
+    </w:p>
+    <w:p>
+      <w:pPr>
+        <w:pStyle w:val="ListBullet"/>
+      </w:pPr>
+      <w:r>
+        <w:t>Revisar PRs do Dependabot — https://docs.github.com/en/code-security/how-tos/secure-your-supply-chain/manage-your-dependency-security/manage-dependabot-prs</w:t>
+      </w:r>
+    </w:p>
+    <w:p>
+      <w:pPr>
+        <w:pStyle w:val="ListBullet"/>
+      </w:pPr>
+      <w:r>
+        <w:t>Secret Scanning e prevenção de vazamentos — https://docs.github.com/en/code-security/how-tos/secure-your-secrets/prevent-future-leaks</w:t>
+      </w:r>
+    </w:p>
+    <w:p>
+      <w:pPr>
+        <w:pStyle w:val="Heading1"/>
+      </w:pPr>
+      <w:r>
+        <w:t>9. Estudo de caso visual dos PRs</w:t>
+      </w:r>
+    </w:p>
+    <w:p>
+      <w:r>
+        <w:t>As telas abaixo registram exercícios deste laboratório em 10/10/2026. Elas mostram resultados observados, não uma promessa de que toda configuração de repositório produzirá os mesmos checks. Os números dos PRs são referências do exercício; em outro repositório, siga os mesmos passos sem depender desses números.</w:t>
+      </w:r>
+    </w:p>
+    <w:p>
+      <w:pPr>
+        <w:pStyle w:val="Heading2"/>
+      </w:pPr>
+      <w:r>
+        <w:t>PR comum sem Code Scanning</w:t>
+      </w:r>
+    </w:p>
+    <w:p>
+      <w:r>
+        <w:t xml:space="preserve">O </w:t>
+      </w:r>
+      <w:r>
+        <w:t>PR #8 — https://github.com/aeroschmidt/scanner-instrument-store/pull/8</w:t>
+      </w:r>
+      <w:r>
+        <w:t xml:space="preserve"> é a referência de um PR pequeno, sem código vulnerável: alterou apenas documentação. A conversa mostra o objetivo, o estado aberto e a ausência de revisões; o painel de checks mostra o workflow </w:t>
+      </w:r>
+      <w:r>
+        <w:rPr>
+          <w:b/>
+        </w:rPr>
+        <w:t>Build and test</w:t>
+      </w:r>
+      <w:r>
+        <w:t xml:space="preserve"> concluído com sucesso. Em </w:t>
+      </w:r>
+      <w:r>
+        <w:rPr>
+          <w:b/>
+        </w:rPr>
+        <w:t>Files changed</w:t>
+      </w:r>
+      <w:r>
+        <w:t xml:space="preserve">, o único arquivo é </w:t>
+      </w:r>
+      <w:r>
+        <w:rPr>
+          <w:rFonts w:ascii="Consolas" w:hAnsi="Consolas"/>
+          <w:color w:val="5B2C83"/>
+          <w:sz w:val="18"/>
+        </w:rPr>
+        <w:t>README.md</w:t>
+      </w:r>
+      <w:r>
+        <w:t>.</w:t>
+      </w:r>
+    </w:p>
+    <w:p>
+      <w:pPr>
+        <w:jc w:val="center"/>
+      </w:pPr>
+      <w:r>
+        <w:drawing>
+          <wp:inline xmlns:a="http://schemas.openxmlformats.org/drawingml/2006/main" xmlns:pic="http://schemas.openxmlformats.org/drawingml/2006/picture">
+            <wp:extent cx="5806440" cy="3268131"/>
+            <wp:docPr id="1" name="Picture 1"/>
+            <wp:cNvGraphicFramePr>
+              <a:graphicFrameLocks noChangeAspect="1"/>
+            </wp:cNvGraphicFramePr>
+            <a:graphic>
+              <a:graphicData uri="http://schemas.openxmlformats.org/drawingml/2006/picture">
+                <pic:pic>
+                  <pic:nvPicPr>
+                    <pic:cNvPr id="0" name="pr8-overview.jpg"/>
+                    <pic:cNvPicPr/>
+                  </pic:nvPicPr>
+                  <pic:blipFill>
+                    <a:blip r:embed="rId11"/>
+                    <a:stretch>
+                      <a:fillRect/>
+                    </a:stretch>
+                  </pic:blipFill>
+                  <pic:spPr>
+                    <a:xfrm>
+                      <a:off x="0" y="0"/>
+                      <a:ext cx="5806440" cy="3268131"/>
+                    </a:xfrm>
+                    <a:prstGeom prst="rect"/>
+                  </pic:spPr>
+                </pic:pic>
+              </a:graphicData>
+            </a:graphic>
+          </wp:inline>
+        </w:drawing>
+      </w:r>
+    </w:p>
+    <w:p>
+      <w:pPr>
+        <w:pStyle w:val="Caption"/>
+        <w:jc w:val="center"/>
+      </w:pPr>
+      <w:r>
+        <w:t>PR comum aberto: descrição, estado e revisão pendente</w:t>
+      </w:r>
+    </w:p>
+    <w:p>
+      <w:pPr>
+        <w:jc w:val="center"/>
+      </w:pPr>
+      <w:r>
+        <w:drawing>
+          <wp:inline xmlns:a="http://schemas.openxmlformats.org/drawingml/2006/main" xmlns:pic="http://schemas.openxmlformats.org/drawingml/2006/picture">
+            <wp:extent cx="5806440" cy="3268131"/>
+            <wp:docPr id="2" name="Picture 2"/>
+            <wp:cNvGraphicFramePr>
+              <a:graphicFrameLocks noChangeAspect="1"/>
+            </wp:cNvGraphicFramePr>
+            <a:graphic>
+              <a:graphicData uri="http://schemas.openxmlformats.org/drawingml/2006/picture">
+                <pic:pic>
+                  <pic:nvPicPr>
+                    <pic:cNvPr id="0" name="pr8-checks.jpg"/>
+                    <pic:cNvPicPr/>
+                  </pic:nvPicPr>
+                  <pic:blipFill>
+                    <a:blip r:embed="rId12"/>
+                    <a:stretch>
+                      <a:fillRect/>
+                    </a:stretch>
+                  </pic:blipFill>
+                  <pic:spPr>
+                    <a:xfrm>
+                      <a:off x="0" y="0"/>
+                      <a:ext cx="5806440" cy="3268131"/>
+                    </a:xfrm>
+                    <a:prstGeom prst="rect"/>
+                  </pic:spPr>
+                </pic:pic>
+              </a:graphicData>
+            </a:graphic>
+          </wp:inline>
+        </w:drawing>
+      </w:r>
+    </w:p>
+    <w:p>
+      <w:pPr>
+        <w:pStyle w:val="Caption"/>
+        <w:jc w:val="center"/>
+      </w:pPr>
+      <w:r>
+        <w:t>PR comum: check de Build and test concluído com sucesso</w:t>
+      </w:r>
+    </w:p>
+    <w:p>
+      <w:pPr>
+        <w:jc w:val="center"/>
+      </w:pPr>
+      <w:r>
+        <w:drawing>
+          <wp:inline xmlns:a="http://schemas.openxmlformats.org/drawingml/2006/main" xmlns:pic="http://schemas.openxmlformats.org/drawingml/2006/picture">
+            <wp:extent cx="5806440" cy="3268131"/>
+            <wp:docPr id="3" name="Picture 3"/>
+            <wp:cNvGraphicFramePr>
+              <a:graphicFrameLocks noChangeAspect="1"/>
+            </wp:cNvGraphicFramePr>
+            <a:graphic>
+              <a:graphicData uri="http://schemas.openxmlformats.org/drawingml/2006/picture">
+                <pic:pic>
+                  <pic:nvPicPr>
+                    <pic:cNvPr id="0" name="pr8-files.jpg"/>
+                    <pic:cNvPicPr/>
+                  </pic:nvPicPr>
+                  <pic:blipFill>
+                    <a:blip r:embed="rId13"/>
+                    <a:stretch>
+                      <a:fillRect/>
+                    </a:stretch>
+                  </pic:blipFill>
+                  <pic:spPr>
+                    <a:xfrm>
+                      <a:off x="0" y="0"/>
+                      <a:ext cx="5806440" cy="3268131"/>
+                    </a:xfrm>
+                    <a:prstGeom prst="rect"/>
+                  </pic:spPr>
+                </pic:pic>
+              </a:graphicData>
+            </a:graphic>
+          </wp:inline>
+        </w:drawing>
+      </w:r>
+    </w:p>
+    <w:p>
+      <w:pPr>
+        <w:pStyle w:val="Caption"/>
+        <w:jc w:val="center"/>
+      </w:pPr>
+      <w:r>
+        <w:t>PR comum: o diff altera apenas o README</w:t>
+      </w:r>
+    </w:p>
+    <w:p>
+      <w:r>
+        <w:t>O resultado verde confirma somente que o workflow configurado passou. Nesse exemplo, não havia Code Scanning executando; portanto, não se deve concluir que o código foi analisado por segurança.</w:t>
+      </w:r>
+    </w:p>
+    <w:p>
+      <w:pPr>
+        <w:pStyle w:val="Heading2"/>
+      </w:pPr>
+      <w:r>
+        <w:t>PR histórico com SQL Injection intencional</w:t>
+      </w:r>
+    </w:p>
+    <w:p>
+      <w:r>
+        <w:t xml:space="preserve">O </w:t>
+      </w:r>
+      <w:r>
+        <w:t>PR #9 — https://github.com/aeroschmidt/scanner-instrument-store/pull/9</w:t>
+      </w:r>
+      <w:r>
+        <w:t xml:space="preserve">, encerrado sem merge, foi um exercício isolado para visualizar uma vulnerabilidade. A alteração insegura foi mantida de propósito para a demonstração e aparece apenas como registro histórico nesta documentação. A página mostra a descrição e o estado atual do PR; a área de checks mostra execuções do workflow Maven, mas não mostra um check do CodeQL. A aba </w:t>
+      </w:r>
+      <w:r>
+        <w:rPr>
+          <w:b/>
+        </w:rPr>
+        <w:t>Files changed</w:t>
+      </w:r>
+      <w:r>
+        <w:t xml:space="preserve"> mostra o diff real.</w:t>
+      </w:r>
+    </w:p>
+    <w:p>
+      <w:pPr>
+        <w:jc w:val="center"/>
+      </w:pPr>
+      <w:r>
+        <w:drawing>
+          <wp:inline xmlns:a="http://schemas.openxmlformats.org/drawingml/2006/main" xmlns:pic="http://schemas.openxmlformats.org/drawingml/2006/picture">
+            <wp:extent cx="5806440" cy="3268131"/>
+            <wp:docPr id="4" name="Picture 4"/>
+            <wp:cNvGraphicFramePr>
+              <a:graphicFrameLocks noChangeAspect="1"/>
+            </wp:cNvGraphicFramePr>
+            <a:graphic>
+              <a:graphicData uri="http://schemas.openxmlformats.org/drawingml/2006/picture">
+                <pic:pic>
+                  <pic:nvPicPr>
+                    <pic:cNvPr id="0" name="pr9-overview.jpg"/>
+                    <pic:cNvPicPr/>
+                  </pic:nvPicPr>
+                  <pic:blipFill>
+                    <a:blip r:embed="rId14"/>
+                    <a:stretch>
+                      <a:fillRect/>
+                    </a:stretch>
+                  </pic:blipFill>
+                  <pic:spPr>
+                    <a:xfrm>
+                      <a:off x="0" y="0"/>
+                      <a:ext cx="5806440" cy="3268131"/>
+                    </a:xfrm>
+                    <a:prstGeom prst="rect"/>
+                  </pic:spPr>
+                </pic:pic>
+              </a:graphicData>
+            </a:graphic>
+          </wp:inline>
+        </w:drawing>
+      </w:r>
+    </w:p>
+    <w:p>
+      <w:pPr>
+        <w:pStyle w:val="Caption"/>
+        <w:jc w:val="center"/>
+      </w:pPr>
+      <w:r>
+        <w:t>PR de laboratório aberto: objetivo, escopo e estado atual</w:t>
+      </w:r>
+    </w:p>
+    <w:p>
+      <w:pPr>
+        <w:jc w:val="center"/>
+      </w:pPr>
+      <w:r>
+        <w:drawing>
+          <wp:inline xmlns:a="http://schemas.openxmlformats.org/drawingml/2006/main" xmlns:pic="http://schemas.openxmlformats.org/drawingml/2006/picture">
+            <wp:extent cx="5806440" cy="3268131"/>
+            <wp:docPr id="5" name="Picture 5"/>
+            <wp:cNvGraphicFramePr>
+              <a:graphicFrameLocks noChangeAspect="1"/>
+            </wp:cNvGraphicFramePr>
+            <a:graphic>
+              <a:graphicData uri="http://schemas.openxmlformats.org/drawingml/2006/picture">
+                <pic:pic>
+                  <pic:nvPicPr>
+                    <pic:cNvPr id="0" name="pr9-checks.jpg"/>
+                    <pic:cNvPicPr/>
+                  </pic:nvPicPr>
+                  <pic:blipFill>
+                    <a:blip r:embed="rId15"/>
+                    <a:stretch>
+                      <a:fillRect/>
+                    </a:stretch>
+                  </pic:blipFill>
+                  <pic:spPr>
+                    <a:xfrm>
+                      <a:off x="0" y="0"/>
+                      <a:ext cx="5806440" cy="3268131"/>
+                    </a:xfrm>
+                    <a:prstGeom prst="rect"/>
+                  </pic:spPr>
+                </pic:pic>
+              </a:graphicData>
+            </a:graphic>
+          </wp:inline>
+        </w:drawing>
+      </w:r>
+    </w:p>
+    <w:p>
+      <w:pPr>
+        <w:pStyle w:val="Caption"/>
+        <w:jc w:val="center"/>
+      </w:pPr>
+      <w:r>
+        <w:t>PR de laboratório: checks de Build and test, sem check de CodeQL</w:t>
+      </w:r>
+    </w:p>
+    <w:p>
+      <w:r>
+        <w:t xml:space="preserve">Na aplicação, a busca normal continua usando consulta parametrizada. A demonstração acrescenta uma rota separada em </w:t>
+      </w:r>
+      <w:r>
+        <w:rPr>
+          <w:rFonts w:ascii="Consolas" w:hAnsi="Consolas"/>
+          <w:color w:val="5B2C83"/>
+          <w:sz w:val="18"/>
+        </w:rPr>
+        <w:t>ProductController.java</w:t>
+      </w:r>
+      <w:r>
+        <w:t xml:space="preserve"> (</w:t>
+      </w:r>
+      <w:r>
+        <w:rPr>
+          <w:rFonts w:ascii="Consolas" w:hAnsi="Consolas"/>
+          <w:color w:val="5B2C83"/>
+          <w:sz w:val="18"/>
+        </w:rPr>
+        <w:t>/api/products/demo/sql-injection</w:t>
+      </w:r>
+      <w:r>
+        <w:t xml:space="preserve">) que encaminha o parâmetro </w:t>
+      </w:r>
+      <w:r>
+        <w:rPr>
+          <w:rFonts w:ascii="Consolas" w:hAnsi="Consolas"/>
+          <w:color w:val="5B2C83"/>
+          <w:sz w:val="18"/>
+        </w:rPr>
+        <w:t>name</w:t>
+      </w:r>
+      <w:r>
+        <w:t xml:space="preserve"> ao método de laboratório em </w:t>
+      </w:r>
+      <w:r>
+        <w:rPr>
+          <w:rFonts w:ascii="Consolas" w:hAnsi="Consolas"/>
+          <w:color w:val="5B2C83"/>
+          <w:sz w:val="18"/>
+        </w:rPr>
+        <w:t>ProductRepository.java</w:t>
+      </w:r>
+      <w:r>
+        <w:t xml:space="preserve">. Esse método monta a instrução SQL concatenando a entrada recebida e a envia a </w:t>
+      </w:r>
+      <w:r>
+        <w:rPr>
+          <w:rFonts w:ascii="Consolas" w:hAnsi="Consolas"/>
+          <w:color w:val="5B2C83"/>
+          <w:sz w:val="18"/>
+        </w:rPr>
+        <w:t>jdbcTemplate.query</w:t>
+      </w:r>
+      <w:r>
+        <w:t>. A rota e a concatenação são as partes deliberadamente inseguras.</w:t>
+      </w:r>
+    </w:p>
+    <w:p>
+      <w:pPr>
+        <w:jc w:val="center"/>
+      </w:pPr>
+      <w:r>
+        <w:drawing>
+          <wp:inline xmlns:a="http://schemas.openxmlformats.org/drawingml/2006/main" xmlns:pic="http://schemas.openxmlformats.org/drawingml/2006/picture">
+            <wp:extent cx="5806440" cy="3268131"/>
+            <wp:docPr id="6" name="Picture 6"/>
+            <wp:cNvGraphicFramePr>
+              <a:graphicFrameLocks noChangeAspect="1"/>
+            </wp:cNvGraphicFramePr>
+            <a:graphic>
+              <a:graphicData uri="http://schemas.openxmlformats.org/drawingml/2006/picture">
+                <pic:pic>
+                  <pic:nvPicPr>
+                    <pic:cNvPr id="0" name="pr9-controller.jpg"/>
+                    <pic:cNvPicPr/>
+                  </pic:nvPicPr>
+                  <pic:blipFill>
+                    <a:blip r:embed="rId16"/>
+                    <a:stretch>
+                      <a:fillRect/>
+                    </a:stretch>
+                  </pic:blipFill>
+                  <pic:spPr>
+                    <a:xfrm>
+                      <a:off x="0" y="0"/>
+                      <a:ext cx="5806440" cy="3268131"/>
+                    </a:xfrm>
+                    <a:prstGeom prst="rect"/>
+                  </pic:spPr>
+                </pic:pic>
+              </a:graphicData>
+            </a:graphic>
+          </wp:inline>
+        </w:drawing>
+      </w:r>
+    </w:p>
+    <w:p>
+      <w:pPr>
+        <w:pStyle w:val="Caption"/>
+        <w:jc w:val="center"/>
+      </w:pPr>
+      <w:r>
+        <w:t>Diff do controller: rota de demonstração direciona a chamada ao método vulnerável</w:t>
+      </w:r>
+    </w:p>
+    <w:p>
+      <w:pPr>
+        <w:jc w:val="center"/>
+      </w:pPr>
+      <w:r>
+        <w:drawing>
+          <wp:inline xmlns:a="http://schemas.openxmlformats.org/drawingml/2006/main" xmlns:pic="http://schemas.openxmlformats.org/drawingml/2006/picture">
+            <wp:extent cx="5806440" cy="3268131"/>
+            <wp:docPr id="7" name="Picture 7"/>
+            <wp:cNvGraphicFramePr>
+              <a:graphicFrameLocks noChangeAspect="1"/>
+            </wp:cNvGraphicFramePr>
+            <a:graphic>
+              <a:graphicData uri="http://schemas.openxmlformats.org/drawingml/2006/picture">
+                <pic:pic>
+                  <pic:nvPicPr>
+                    <pic:cNvPr id="0" name="pr9-files.jpg"/>
+                    <pic:cNvPicPr/>
+                  </pic:nvPicPr>
+                  <pic:blipFill>
+                    <a:blip r:embed="rId17"/>
+                    <a:stretch>
+                      <a:fillRect/>
+                    </a:stretch>
+                  </pic:blipFill>
+                  <pic:spPr>
+                    <a:xfrm>
+                      <a:off x="0" y="0"/>
+                      <a:ext cx="5806440" cy="3268131"/>
+                    </a:xfrm>
+                    <a:prstGeom prst="rect"/>
+                  </pic:spPr>
+                </pic:pic>
+              </a:graphicData>
+            </a:graphic>
+          </wp:inline>
+        </w:drawing>
+      </w:r>
+    </w:p>
+    <w:p>
+      <w:pPr>
+        <w:pStyle w:val="Caption"/>
+        <w:jc w:val="center"/>
+      </w:pPr>
+      <w:r>
+        <w:t>Diff do repositório: a consulta SQL concatena diretamente o parâmetro recebido</w:t>
+      </w:r>
+    </w:p>
+    <w:p>
+      <w:r>
+        <w:rPr>
+          <w:b/>
+        </w:rPr>
+        <w:t>O que funciona e o que não foi verificado neste PR:</w:t>
+      </w:r>
+      <w:r>
+        <w:t xml:space="preserve"> o build Maven pode compilar a aplicação e os testes existentes podem passar mesmo com esse caminho inseguro, pois sucesso de build não é análise estática de segurança. Na execução capturada naquela época, o GitHub Actions passou; naquele estado histórico, o Code Scanning estava desligado e nenhum alerta do CodeQL era esperado. O cartão “Ready to merge” também não certifica segurança: indica apenas o estado das regras e checks configurados no repositório naquele momento.</w:t>
+      </w:r>
+    </w:p>
+    <w:p>
+      <w:pPr>
+        <w:pStyle w:val="Heading2"/>
+      </w:pPr>
+      <w:r>
+        <w:t>Evidência anterior com Code Scanning ativo</w:t>
+      </w:r>
+    </w:p>
+    <w:p>
+      <w:r>
+        <w:t xml:space="preserve">Para comparar com o caso atual, o PR histórico </w:t>
+      </w:r>
+      <w:r>
+        <w:t>#7 — https://github.com/aeroschmidt/scanner-instrument-store/pull/7</w:t>
+      </w:r>
+      <w:r>
+        <w:t xml:space="preserve"> contém a captura de uma análise do CodeQL que apontou um alerta </w:t>
+      </w:r>
+      <w:r>
+        <w:rPr>
+          <w:b/>
+        </w:rPr>
+        <w:t>High</w:t>
+      </w:r>
+      <w:r>
+        <w:t xml:space="preserve"> na chamada de </w:t>
+      </w:r>
+      <w:r>
+        <w:rPr>
+          <w:rFonts w:ascii="Consolas" w:hAnsi="Consolas"/>
+          <w:color w:val="5B2C83"/>
+          <w:sz w:val="18"/>
+        </w:rPr>
+        <w:t>jdbcTemplate.query</w:t>
+      </w:r>
+      <w:r>
+        <w:t>, na linha que envia a consulta concatenada. A origem do dado não confiável aparece na montagem da SQL logo acima. A alteração foi posteriormente corrigida antes de o PR #7 ser integrado; a captura documenta a revisão histórica, não o estado atual da branch principal.</w:t>
+      </w:r>
+    </w:p>
+    <w:p>
+      <w:pPr>
+        <w:jc w:val="center"/>
+      </w:pPr>
+      <w:r>
+        <w:drawing>
+          <wp:inline xmlns:a="http://schemas.openxmlformats.org/drawingml/2006/main" xmlns:pic="http://schemas.openxmlformats.org/drawingml/2006/picture">
+            <wp:extent cx="5806440" cy="3268131"/>
+            <wp:docPr id="8" name="Picture 8"/>
+            <wp:cNvGraphicFramePr>
+              <a:graphicFrameLocks noChangeAspect="1"/>
+            </wp:cNvGraphicFramePr>
+            <a:graphic>
+              <a:graphicData uri="http://schemas.openxmlformats.org/drawingml/2006/picture">
+                <pic:pic>
+                  <pic:nvPicPr>
+                    <pic:cNvPr id="0" name="pr7-code-scanning.jpg"/>
+                    <pic:cNvPicPr/>
+                  </pic:nvPicPr>
+                  <pic:blipFill>
+                    <a:blip r:embed="rId18"/>
+                    <a:stretch>
+                      <a:fillRect/>
+                    </a:stretch>
+                  </pic:blipFill>
+                  <pic:spPr>
+                    <a:xfrm>
+                      <a:off x="0" y="0"/>
+                      <a:ext cx="5806440" cy="3268131"/>
+                    </a:xfrm>
+                    <a:prstGeom prst="rect"/>
+                  </pic:spPr>
+                </pic:pic>
+              </a:graphicData>
+            </a:graphic>
+          </wp:inline>
+        </w:drawing>
+      </w:r>
+    </w:p>
+    <w:p>
+      <w:pPr>
+        <w:pStyle w:val="Caption"/>
+        <w:jc w:val="center"/>
+      </w:pPr>
+      <w:r>
+        <w:t>PR histórico: alerta High do CodeQL anotado na chamada jdbcTemplate.query</w:t>
+      </w:r>
+    </w:p>
+    <w:p>
+      <w:r>
+        <w:t xml:space="preserve">Na execução associada à versão vulnerável, o job Maven também falhou na etapa de testes. O log mostra </w:t>
+      </w:r>
+      <w:r>
+        <w:rPr>
+          <w:rFonts w:ascii="Consolas" w:hAnsi="Consolas"/>
+          <w:color w:val="5B2C83"/>
+          <w:sz w:val="18"/>
+        </w:rPr>
+        <w:t>BUILD FAILURE</w:t>
+      </w:r>
+      <w:r>
+        <w:t xml:space="preserve"> e falha do objetivo </w:t>
+      </w:r>
+      <w:r>
+        <w:rPr>
+          <w:rFonts w:ascii="Consolas" w:hAnsi="Consolas"/>
+          <w:color w:val="5B2C83"/>
+          <w:sz w:val="18"/>
+        </w:rPr>
+        <w:t>maven-surefire-plugin:test</w:t>
+      </w:r>
+      <w:r>
+        <w:t>. Esse resultado veio dos testes da aplicação; é diferente do alerta estático do CodeQL. Uma vulnerabilidade não precisa fazer o build falhar: neste exercício, a falha Maven e o alerta CodeQL foram sinais independentes.</w:t>
+      </w:r>
+    </w:p>
+    <w:p>
+      <w:pPr>
+        <w:jc w:val="center"/>
+      </w:pPr>
+      <w:r>
+        <w:drawing>
+          <wp:inline xmlns:a="http://schemas.openxmlformats.org/drawingml/2006/main" xmlns:pic="http://schemas.openxmlformats.org/drawingml/2006/picture">
+            <wp:extent cx="5806440" cy="3268131"/>
+            <wp:docPr id="9" name="Picture 9"/>
+            <wp:cNvGraphicFramePr>
+              <a:graphicFrameLocks noChangeAspect="1"/>
+            </wp:cNvGraphicFramePr>
+            <a:graphic>
+              <a:graphicData uri="http://schemas.openxmlformats.org/drawingml/2006/picture">
+                <pic:pic>
+                  <pic:nvPicPr>
+                    <pic:cNvPr id="0" name="pr7-checks.jpg"/>
+                    <pic:cNvPicPr/>
+                  </pic:nvPicPr>
+                  <pic:blipFill>
+                    <a:blip r:embed="rId19"/>
+                    <a:stretch>
+                      <a:fillRect/>
+                    </a:stretch>
+                  </pic:blipFill>
+                  <pic:spPr>
+                    <a:xfrm>
+                      <a:off x="0" y="0"/>
+                      <a:ext cx="5806440" cy="3268131"/>
+                    </a:xfrm>
+                    <a:prstGeom prst="rect"/>
+                  </pic:spPr>
+                </pic:pic>
+              </a:graphicData>
+            </a:graphic>
+          </wp:inline>
+        </w:drawing>
+      </w:r>
+    </w:p>
+    <w:p>
+      <w:pPr>
+        <w:pStyle w:val="Caption"/>
+        <w:jc w:val="center"/>
+      </w:pPr>
+      <w:r>
+        <w:t>Execução histórica: o job Maven falhou na etapa de testes</w:t>
+      </w:r>
+    </w:p>
+    <w:p>
+      <w:r>
+        <w:t>O CodeQL pode apontar arquivo, localização e regra quando a análise executada reconhece o fluxo vulnerável. Isso, por si só, não torna o alerta um bloqueio de merge. Para impedir integração, a equipe precisa configurar uma regra que exija o check apropriado; além disso, alertas e checks são estados distintos. A decisão final deve seguir a revisão e aprovação humana exigidas pelo repositório.</w:t>
+      </w:r>
+    </w:p>
+    <w:p>
+      <w:pPr>
+        <w:pStyle w:val="Heading2"/>
+      </w:pPr>
+      <w:r>
+        <w:t>Como interpretar a comparação</w:t>
+      </w:r>
+    </w:p>
+    <w:p>
+      <w:pPr>
+        <w:pStyle w:val="ListBullet"/>
+      </w:pPr>
+      <w:r>
+        <w:rPr>
+          <w:b/>
+        </w:rPr>
+        <w:t>PR #8, documentação sem Code Scanning:</w:t>
+      </w:r>
+      <w:r>
+        <w:t xml:space="preserve"> o workflow de build/teste ficou verde e o diff foi pequeno. Isso não mostra uma análise de segurança do código.</w:t>
+      </w:r>
+    </w:p>
+    <w:p>
+      <w:pPr>
+        <w:pStyle w:val="ListBullet"/>
+      </w:pPr>
+      <w:r>
+        <w:rPr>
+          <w:b/>
+        </w:rPr>
+        <w:t>PR #9 histórico, SQL Injection com Code Scanning desligado naquela época:</w:t>
+      </w:r>
+      <w:r>
+        <w:t xml:space="preserve"> o workflow ficou verde e o diff mostra o caminho inseguro; não há check do CodeQL. Isso não significa que o código está seguro nem que passou por análise estática.</w:t>
+      </w:r>
+    </w:p>
+    <w:p>
+      <w:pPr>
+        <w:pStyle w:val="ListBullet"/>
+      </w:pPr>
+      <w:r>
+        <w:rPr>
+          <w:b/>
+        </w:rPr>
+        <w:t>PR #7 histórico, CodeQL ativo:</w:t>
+      </w:r>
+      <w:r>
+        <w:t xml:space="preserve"> há um alerta High localizado na chamada SQL e um job Maven que falhou nos testes. Isso não significa que todo alerta falha o build ou bloqueia o merge.</w:t>
+      </w:r>
+    </w:p>
+    <w:p>
+      <w:r>
+        <w:t>Os screenshots preservam o contexto de cada tela. Ao registrar uma nova ferramenta ou alteração de configuração, capture também o estado anterior, o diff, os checks e a localização do alerta ou falha; identifique se a imagem é atual ou histórica e não exponha credenciais ou dados reais.</w:t>
       </w:r>
     </w:p>
     <w:sectPr>
@@ -549,7 +1869,7 @@
       <w:jc w:val="center"/>
     </w:pPr>
     <w:r>
-      <w:t>Trilha de aprendizado • Atualizado em 10/10/2026</w:t>
+      <w:t>Fluxo de contribuição e verificações de segurança no GitHub</w:t>
     </w:r>
   </w:p>
 </w:ftr>
@@ -563,7 +1883,7 @@
       <w:jc w:val="right"/>
     </w:pPr>
     <w:r>
-      <w:t>SOM &amp; CORDA  |  GUIA OPERACIONAL</w:t>
+      <w:t>GUIA DO USUÁRIO  |  PULL REQUESTS E VERIFICAÇÕES</w:t>
     </w:r>
   </w:p>
 </w:hdr>

</xml_diff>